<commit_message>
FIX: Alteração para atualizar o currículo.
</commit_message>
<xml_diff>
--- a/Arquivo/CV_Victor_Pereira.docx
+++ b/Arquivo/CV_Victor_Pereira.docx
@@ -1,6 +1,7 @@
 
 <file path=word/document.xml><?xml version="1.0" encoding="utf-8"?>
 <w:document xmlns:wpc="http://schemas.microsoft.com/office/word/2010/wordprocessingCanvas" xmlns:mc="http://schemas.openxmlformats.org/markup-compatibility/2006" xmlns:o="urn:schemas-microsoft-com:office:office" xmlns:r="http://schemas.openxmlformats.org/officeDocument/2006/relationships" xmlns:m="http://schemas.openxmlformats.org/officeDocument/2006/math" xmlns:v="urn:schemas-microsoft-com:vml" xmlns:wp14="http://schemas.microsoft.com/office/word/2010/wordprocessingDrawing" xmlns:wp="http://schemas.openxmlformats.org/drawingml/2006/wordprocessingDrawing" xmlns:w10="urn:schemas-microsoft-com:office:word" xmlns:w="http://schemas.openxmlformats.org/wordprocessingml/2006/main" xmlns:w14="http://schemas.microsoft.com/office/word/2010/wordml" xmlns:w15="http://schemas.microsoft.com/office/word/2012/wordml" xmlns:wpg="http://schemas.microsoft.com/office/word/2010/wordprocessingGroup" xmlns:wpi="http://schemas.microsoft.com/office/word/2010/wordprocessingInk" xmlns:wne="http://schemas.microsoft.com/office/word/2006/wordml" xmlns:wps="http://schemas.microsoft.com/office/word/2010/wordprocessingShape" xmlns:cx="http://schemas.microsoft.com/office/drawing/2014/chartex" xmlns:cx1="http://schemas.microsoft.com/office/drawing/2015/9/8/chartex" xmlns:cx2="http://schemas.microsoft.com/office/drawing/2015/10/21/chartex" xmlns:cx3="http://schemas.microsoft.com/office/drawing/2016/5/9/chartex" xmlns:cx4="http://schemas.microsoft.com/office/drawing/2016/5/10/chartex" xmlns:cx5="http://schemas.microsoft.com/office/drawing/2016/5/11/chartex" xmlns:cx6="http://schemas.microsoft.com/office/drawing/2016/5/12/chartex" xmlns:cx7="http://schemas.microsoft.com/office/drawing/2016/5/13/chartex" xmlns:cx8="http://schemas.microsoft.com/office/drawing/2016/5/14/chartex" xmlns:aink="http://schemas.microsoft.com/office/drawing/2016/ink" xmlns:am3d="http://schemas.microsoft.com/office/drawing/2017/model3d" xmlns:w16cex="http://schemas.microsoft.com/office/word/2018/wordml/cex" xmlns:w16cid="http://schemas.microsoft.com/office/word/2016/wordml/cid" xmlns:w16="http://schemas.microsoft.com/office/word/2018/wordml" xmlns:w16sdtdh="http://schemas.microsoft.com/office/word/2020/wordml/sdtdatahash" xmlns:w16se="http://schemas.microsoft.com/office/word/2015/wordml/symex" mc:Ignorable="w14 w15 wp14">
+  <w:background w:color="000000"/>
   <w:body>
     <w:tbl>
       <w:tblPr>
@@ -23,11 +24,11 @@
             <w:tcW w:type="dxa" w:w="10206"/>
             <w:tcBorders>
               <w:top w:val="none" w:color="FFFFFF" w:sz="0"/>
-              <w:left w:val="none" w:color="FFFFFF" w:sz="0"/>
-              <w:bottom w:val="none" w:color="FFFFFF" w:sz="0"/>
+              <w:left w:val="single" w:color="4FD1C5" w:sz="48" w:space="0"/>
+              <w:bottom w:val="single" w:color="4FD1C5" w:sz="8" w:space="0"/>
               <w:right w:val="none" w:color="FFFFFF" w:sz="0"/>
             </w:tcBorders>
-            <w:shd w:fill="1F3A5F" w:color="auto" w:val="clear"/>
+            <w:shd w:fill="141414" w:color="auto" w:val="clear"/>
             <w:tcMar>
               <w:top w:type="dxa" w:w="190"/>
               <w:left w:type="dxa" w:w="340"/>
@@ -59,7 +60,7 @@
             <w:r>
               <w:rPr>
                 <w:rFonts w:ascii="Calibri" w:cs="Calibri" w:eastAsia="Calibri" w:hAnsi="Calibri"/>
-                <w:color w:val="9FD3DC"/>
+                <w:color w:val="4FD1C5"/>
                 <w:sz w:val="22"/>
                 <w:szCs w:val="22"/>
               </w:rPr>
@@ -98,16 +99,16 @@
       <w:pPr>
         <w:keepNext/>
         <w:pBdr>
-          <w:bottom w:val="single" w:color="2A7F8E" w:sz="8" w:space="3"/>
+          <w:bottom w:val="single" w:color="4FD1C5" w:sz="8" w:space="3"/>
         </w:pBdr>
-        <w:spacing w:after="70" w:before="140"/>
+        <w:spacing w:after="50" w:before="90"/>
       </w:pPr>
       <w:r>
         <w:rPr>
           <w:rFonts w:ascii="Calibri" w:cs="Calibri" w:eastAsia="Calibri" w:hAnsi="Calibri"/>
           <w:b/>
           <w:bCs/>
-          <w:color w:val="1F3A5F"/>
+          <w:color w:val="4FD1C5"/>
           <w:spacing w:val="40"/>
           <w:sz w:val="23"/>
           <w:szCs w:val="23"/>
@@ -123,27 +124,27 @@
       <w:r>
         <w:rPr>
           <w:rFonts w:ascii="Calibri" w:cs="Calibri" w:eastAsia="Calibri" w:hAnsi="Calibri"/>
-          <w:color w:val="222B36"/>
-          <w:sz w:val="19"/>
-          <w:szCs w:val="19"/>
-        </w:rPr>
-        <w:t xml:space="preserve">Profissional da área de Sistemas de Informação, atuando como Analista de Sistemas no setor de seguros, com forte capacidade analítica e busca constante por atualização tecnológica. Experiência no desenvolvimento e análise de APIs RESTful, programação em C#, criação de procedures e scripts em Microsoft SQL Server, e desenvolvimento web com HTML, CSS e JavaScript. Vivência também na área financeira, com uso avançado de Excel. Inglês fluente, boa capacidade de aprendizado, adaptação e trabalho em equipe.</w:t>
+          <w:color w:val="F2F2F2"/>
+          <w:sz w:val="19"/>
+          <w:szCs w:val="19"/>
+        </w:rPr>
+        <w:t xml:space="preserve">Profissional da área de Sistemas de Informação, atuando como Analista de Sistemas no setor de seguros, com forte capacidade analítica e busca constante por atualização tecnológica. Experiência no desenvolvimento e análise de APIs RESTful, programação em C#, criação de procedures e scripts em Microsoft SQL Server, e desenvolvimento web com HTML, CSS e JavaScript. Versionamento de código com Git e atuação em times ágeis com Scrum. Vivência também na área financeira, com uso avançado de Excel. Inglês fluente, boa capacidade de aprendizado, adaptação e trabalho em equipe.</w:t>
       </w:r>
     </w:p>
     <w:p>
       <w:pPr>
         <w:keepNext/>
         <w:pBdr>
-          <w:bottom w:val="single" w:color="2A7F8E" w:sz="8" w:space="3"/>
+          <w:bottom w:val="single" w:color="4FD1C5" w:sz="8" w:space="3"/>
         </w:pBdr>
-        <w:spacing w:after="70" w:before="140"/>
+        <w:spacing w:after="50" w:before="90"/>
       </w:pPr>
       <w:r>
         <w:rPr>
           <w:rFonts w:ascii="Calibri" w:cs="Calibri" w:eastAsia="Calibri" w:hAnsi="Calibri"/>
           <w:b/>
           <w:bCs/>
-          <w:color w:val="1F3A5F"/>
+          <w:color w:val="4FD1C5"/>
           <w:spacing w:val="40"/>
           <w:sz w:val="23"/>
           <w:szCs w:val="23"/>
@@ -157,14 +158,14 @@
         <w:tabs>
           <w:tab w:val="right" w:pos="10206"/>
         </w:tabs>
-        <w:spacing w:after="15" w:before="90"/>
+        <w:spacing w:after="10" w:before="60"/>
       </w:pPr>
       <w:r>
         <w:rPr>
           <w:rFonts w:ascii="Calibri" w:cs="Calibri" w:eastAsia="Calibri" w:hAnsi="Calibri"/>
           <w:b/>
           <w:bCs/>
-          <w:color w:val="1F3A5F"/>
+          <w:color w:val="4FD1C5"/>
           <w:sz w:val="22"/>
           <w:szCs w:val="22"/>
         </w:rPr>
@@ -173,7 +174,7 @@
       <w:r>
         <w:rPr>
           <w:rFonts w:ascii="Calibri" w:cs="Calibri" w:eastAsia="Calibri" w:hAnsi="Calibri"/>
-          <w:color w:val="5A6472"/>
+          <w:color w:val="A9B4C0"/>
           <w:sz w:val="19"/>
           <w:szCs w:val="19"/>
         </w:rPr>
@@ -187,12 +188,12 @@
           <w:ilvl w:val="0"/>
           <w:numId w:val="2"/>
         </w:numPr>
-        <w:spacing w:after="25" w:line="245"/>
-      </w:pPr>
-      <w:r>
-        <w:rPr>
-          <w:rFonts w:ascii="Calibri" w:cs="Calibri" w:eastAsia="Calibri" w:hAnsi="Calibri"/>
-          <w:color w:val="222B36"/>
+        <w:spacing w:after="10" w:line="240"/>
+      </w:pPr>
+      <w:r>
+        <w:rPr>
+          <w:rFonts w:ascii="Calibri" w:cs="Calibri" w:eastAsia="Calibri" w:hAnsi="Calibri"/>
+          <w:color w:val="F2F2F2"/>
           <w:sz w:val="19"/>
           <w:szCs w:val="19"/>
         </w:rPr>
@@ -206,12 +207,12 @@
           <w:ilvl w:val="0"/>
           <w:numId w:val="2"/>
         </w:numPr>
-        <w:spacing w:after="25" w:line="245"/>
-      </w:pPr>
-      <w:r>
-        <w:rPr>
-          <w:rFonts w:ascii="Calibri" w:cs="Calibri" w:eastAsia="Calibri" w:hAnsi="Calibri"/>
-          <w:color w:val="222B36"/>
+        <w:spacing w:after="10" w:line="240"/>
+      </w:pPr>
+      <w:r>
+        <w:rPr>
+          <w:rFonts w:ascii="Calibri" w:cs="Calibri" w:eastAsia="Calibri" w:hAnsi="Calibri"/>
+          <w:color w:val="F2F2F2"/>
           <w:sz w:val="19"/>
           <w:szCs w:val="19"/>
         </w:rPr>
@@ -225,12 +226,12 @@
           <w:ilvl w:val="0"/>
           <w:numId w:val="2"/>
         </w:numPr>
-        <w:spacing w:after="25" w:line="245"/>
-      </w:pPr>
-      <w:r>
-        <w:rPr>
-          <w:rFonts w:ascii="Calibri" w:cs="Calibri" w:eastAsia="Calibri" w:hAnsi="Calibri"/>
-          <w:color w:val="222B36"/>
+        <w:spacing w:after="10" w:line="240"/>
+      </w:pPr>
+      <w:r>
+        <w:rPr>
+          <w:rFonts w:ascii="Calibri" w:cs="Calibri" w:eastAsia="Calibri" w:hAnsi="Calibri"/>
+          <w:color w:val="F2F2F2"/>
           <w:sz w:val="19"/>
           <w:szCs w:val="19"/>
         </w:rPr>
@@ -244,12 +245,12 @@
           <w:ilvl w:val="0"/>
           <w:numId w:val="2"/>
         </w:numPr>
-        <w:spacing w:after="25" w:line="245"/>
-      </w:pPr>
-      <w:r>
-        <w:rPr>
-          <w:rFonts w:ascii="Calibri" w:cs="Calibri" w:eastAsia="Calibri" w:hAnsi="Calibri"/>
-          <w:color w:val="222B36"/>
+        <w:spacing w:after="10" w:line="240"/>
+      </w:pPr>
+      <w:r>
+        <w:rPr>
+          <w:rFonts w:ascii="Calibri" w:cs="Calibri" w:eastAsia="Calibri" w:hAnsi="Calibri"/>
+          <w:color w:val="F2F2F2"/>
           <w:sz w:val="19"/>
           <w:szCs w:val="19"/>
         </w:rPr>
@@ -263,12 +264,12 @@
           <w:ilvl w:val="0"/>
           <w:numId w:val="2"/>
         </w:numPr>
-        <w:spacing w:after="25" w:line="245"/>
-      </w:pPr>
-      <w:r>
-        <w:rPr>
-          <w:rFonts w:ascii="Calibri" w:cs="Calibri" w:eastAsia="Calibri" w:hAnsi="Calibri"/>
-          <w:color w:val="222B36"/>
+        <w:spacing w:after="10" w:line="240"/>
+      </w:pPr>
+      <w:r>
+        <w:rPr>
+          <w:rFonts w:ascii="Calibri" w:cs="Calibri" w:eastAsia="Calibri" w:hAnsi="Calibri"/>
+          <w:color w:val="F2F2F2"/>
           <w:sz w:val="19"/>
           <w:szCs w:val="19"/>
         </w:rPr>
@@ -282,16 +283,54 @@
           <w:ilvl w:val="0"/>
           <w:numId w:val="2"/>
         </w:numPr>
-        <w:spacing w:after="25" w:line="245"/>
-      </w:pPr>
-      <w:r>
-        <w:rPr>
-          <w:rFonts w:ascii="Calibri" w:cs="Calibri" w:eastAsia="Calibri" w:hAnsi="Calibri"/>
-          <w:color w:val="222B36"/>
+        <w:spacing w:after="10" w:line="240"/>
+      </w:pPr>
+      <w:r>
+        <w:rPr>
+          <w:rFonts w:ascii="Calibri" w:cs="Calibri" w:eastAsia="Calibri" w:hAnsi="Calibri"/>
+          <w:color w:val="F2F2F2"/>
           <w:sz w:val="19"/>
           <w:szCs w:val="19"/>
         </w:rPr>
         <w:t xml:space="preserve">Vivência com desenvolvimento em linguagem VB.</w:t>
+      </w:r>
+    </w:p>
+    <w:p>
+      <w:pPr>
+        <w:pStyle w:val="ListParagraph"/>
+        <w:numPr>
+          <w:ilvl w:val="0"/>
+          <w:numId w:val="2"/>
+        </w:numPr>
+        <w:spacing w:after="10" w:line="240"/>
+      </w:pPr>
+      <w:r>
+        <w:rPr>
+          <w:rFonts w:ascii="Calibri" w:cs="Calibri" w:eastAsia="Calibri" w:hAnsi="Calibri"/>
+          <w:color w:val="F2F2F2"/>
+          <w:sz w:val="19"/>
+          <w:szCs w:val="19"/>
+        </w:rPr>
+        <w:t xml:space="preserve">Versionamento de código com Git (branches, commits e pull requests), garantindo rastreabilidade e colaboração.</w:t>
+      </w:r>
+    </w:p>
+    <w:p>
+      <w:pPr>
+        <w:pStyle w:val="ListParagraph"/>
+        <w:numPr>
+          <w:ilvl w:val="0"/>
+          <w:numId w:val="2"/>
+        </w:numPr>
+        <w:spacing w:after="10" w:line="240"/>
+      </w:pPr>
+      <w:r>
+        <w:rPr>
+          <w:rFonts w:ascii="Calibri" w:cs="Calibri" w:eastAsia="Calibri" w:hAnsi="Calibri"/>
+          <w:color w:val="F2F2F2"/>
+          <w:sz w:val="19"/>
+          <w:szCs w:val="19"/>
+        </w:rPr>
+        <w:t xml:space="preserve">Atuação em equipe com metodologia ágil Scrum (sprints, dailies e revisões).</w:t>
       </w:r>
     </w:p>
     <w:p>
@@ -300,14 +339,14 @@
         <w:tabs>
           <w:tab w:val="right" w:pos="10206"/>
         </w:tabs>
-        <w:spacing w:after="15" w:before="90"/>
+        <w:spacing w:after="10" w:before="60"/>
       </w:pPr>
       <w:r>
         <w:rPr>
           <w:rFonts w:ascii="Calibri" w:cs="Calibri" w:eastAsia="Calibri" w:hAnsi="Calibri"/>
           <w:b/>
           <w:bCs/>
-          <w:color w:val="1F3A5F"/>
+          <w:color w:val="4FD1C5"/>
           <w:sz w:val="22"/>
           <w:szCs w:val="22"/>
         </w:rPr>
@@ -316,7 +355,7 @@
       <w:r>
         <w:rPr>
           <w:rFonts w:ascii="Calibri" w:cs="Calibri" w:eastAsia="Calibri" w:hAnsi="Calibri"/>
-          <w:color w:val="5A6472"/>
+          <w:color w:val="A9B4C0"/>
           <w:sz w:val="19"/>
           <w:szCs w:val="19"/>
         </w:rPr>
@@ -330,12 +369,12 @@
           <w:ilvl w:val="0"/>
           <w:numId w:val="2"/>
         </w:numPr>
-        <w:spacing w:after="25" w:line="245"/>
-      </w:pPr>
-      <w:r>
-        <w:rPr>
-          <w:rFonts w:ascii="Calibri" w:cs="Calibri" w:eastAsia="Calibri" w:hAnsi="Calibri"/>
-          <w:color w:val="222B36"/>
+        <w:spacing w:after="10" w:line="240"/>
+      </w:pPr>
+      <w:r>
+        <w:rPr>
+          <w:rFonts w:ascii="Calibri" w:cs="Calibri" w:eastAsia="Calibri" w:hAnsi="Calibri"/>
+          <w:color w:val="F2F2F2"/>
           <w:sz w:val="19"/>
           <w:szCs w:val="19"/>
         </w:rPr>
@@ -349,12 +388,12 @@
           <w:ilvl w:val="0"/>
           <w:numId w:val="2"/>
         </w:numPr>
-        <w:spacing w:after="25" w:line="245"/>
-      </w:pPr>
-      <w:r>
-        <w:rPr>
-          <w:rFonts w:ascii="Calibri" w:cs="Calibri" w:eastAsia="Calibri" w:hAnsi="Calibri"/>
-          <w:color w:val="222B36"/>
+        <w:spacing w:after="10" w:line="240"/>
+      </w:pPr>
+      <w:r>
+        <w:rPr>
+          <w:rFonts w:ascii="Calibri" w:cs="Calibri" w:eastAsia="Calibri" w:hAnsi="Calibri"/>
+          <w:color w:val="F2F2F2"/>
           <w:sz w:val="19"/>
           <w:szCs w:val="19"/>
         </w:rPr>
@@ -365,16 +404,16 @@
       <w:pPr>
         <w:keepNext/>
         <w:pBdr>
-          <w:bottom w:val="single" w:color="2A7F8E" w:sz="8" w:space="3"/>
+          <w:bottom w:val="single" w:color="4FD1C5" w:sz="8" w:space="3"/>
         </w:pBdr>
-        <w:spacing w:after="70" w:before="140"/>
+        <w:spacing w:after="50" w:before="90"/>
       </w:pPr>
       <w:r>
         <w:rPr>
           <w:rFonts w:ascii="Calibri" w:cs="Calibri" w:eastAsia="Calibri" w:hAnsi="Calibri"/>
           <w:b/>
           <w:bCs/>
-          <w:color w:val="1F3A5F"/>
+          <w:color w:val="4FD1C5"/>
           <w:spacing w:val="40"/>
           <w:sz w:val="23"/>
           <w:szCs w:val="23"/>
@@ -389,12 +428,12 @@
           <w:ilvl w:val="0"/>
           <w:numId w:val="2"/>
         </w:numPr>
-        <w:spacing w:after="25" w:line="245"/>
-      </w:pPr>
-      <w:r>
-        <w:rPr>
-          <w:rFonts w:ascii="Calibri" w:cs="Calibri" w:eastAsia="Calibri" w:hAnsi="Calibri"/>
-          <w:color w:val="222B36"/>
+        <w:spacing w:after="10" w:line="240"/>
+      </w:pPr>
+      <w:r>
+        <w:rPr>
+          <w:rFonts w:ascii="Calibri" w:cs="Calibri" w:eastAsia="Calibri" w:hAnsi="Calibri"/>
+          <w:color w:val="F2F2F2"/>
           <w:sz w:val="19"/>
           <w:szCs w:val="19"/>
         </w:rPr>
@@ -407,14 +446,14 @@
         <w:tabs>
           <w:tab w:val="right" w:pos="10206"/>
         </w:tabs>
-        <w:spacing w:after="15" w:before="90"/>
+        <w:spacing w:after="10" w:before="60"/>
       </w:pPr>
       <w:r>
         <w:rPr>
           <w:rFonts w:ascii="Calibri" w:cs="Calibri" w:eastAsia="Calibri" w:hAnsi="Calibri"/>
           <w:b/>
           <w:bCs/>
-          <w:color w:val="1F3A5F"/>
+          <w:color w:val="4FD1C5"/>
           <w:sz w:val="22"/>
           <w:szCs w:val="22"/>
         </w:rPr>
@@ -423,7 +462,7 @@
       <w:r>
         <w:rPr>
           <w:rFonts w:ascii="Calibri" w:cs="Calibri" w:eastAsia="Calibri" w:hAnsi="Calibri"/>
-          <w:color w:val="5A6472"/>
+          <w:color w:val="A9B4C0"/>
           <w:sz w:val="19"/>
           <w:szCs w:val="19"/>
         </w:rPr>
@@ -437,12 +476,12 @@
           <w:ilvl w:val="0"/>
           <w:numId w:val="2"/>
         </w:numPr>
-        <w:spacing w:after="25" w:line="245"/>
-      </w:pPr>
-      <w:r>
-        <w:rPr>
-          <w:rFonts w:ascii="Calibri" w:cs="Calibri" w:eastAsia="Calibri" w:hAnsi="Calibri"/>
-          <w:color w:val="222B36"/>
+        <w:spacing w:after="10" w:line="240"/>
+      </w:pPr>
+      <w:r>
+        <w:rPr>
+          <w:rFonts w:ascii="Calibri" w:cs="Calibri" w:eastAsia="Calibri" w:hAnsi="Calibri"/>
+          <w:color w:val="F2F2F2"/>
           <w:sz w:val="19"/>
           <w:szCs w:val="19"/>
         </w:rPr>
@@ -456,12 +495,12 @@
           <w:ilvl w:val="0"/>
           <w:numId w:val="2"/>
         </w:numPr>
-        <w:spacing w:after="25" w:line="245"/>
-      </w:pPr>
-      <w:r>
-        <w:rPr>
-          <w:rFonts w:ascii="Calibri" w:cs="Calibri" w:eastAsia="Calibri" w:hAnsi="Calibri"/>
-          <w:color w:val="222B36"/>
+        <w:spacing w:after="10" w:line="240"/>
+      </w:pPr>
+      <w:r>
+        <w:rPr>
+          <w:rFonts w:ascii="Calibri" w:cs="Calibri" w:eastAsia="Calibri" w:hAnsi="Calibri"/>
+          <w:color w:val="F2F2F2"/>
           <w:sz w:val="19"/>
           <w:szCs w:val="19"/>
         </w:rPr>
@@ -475,12 +514,12 @@
           <w:ilvl w:val="0"/>
           <w:numId w:val="2"/>
         </w:numPr>
-        <w:spacing w:after="25" w:line="245"/>
-      </w:pPr>
-      <w:r>
-        <w:rPr>
-          <w:rFonts w:ascii="Calibri" w:cs="Calibri" w:eastAsia="Calibri" w:hAnsi="Calibri"/>
-          <w:color w:val="222B36"/>
+        <w:spacing w:after="10" w:line="240"/>
+      </w:pPr>
+      <w:r>
+        <w:rPr>
+          <w:rFonts w:ascii="Calibri" w:cs="Calibri" w:eastAsia="Calibri" w:hAnsi="Calibri"/>
+          <w:color w:val="F2F2F2"/>
           <w:sz w:val="19"/>
           <w:szCs w:val="19"/>
         </w:rPr>
@@ -494,12 +533,12 @@
           <w:ilvl w:val="0"/>
           <w:numId w:val="2"/>
         </w:numPr>
-        <w:spacing w:after="25" w:line="245"/>
-      </w:pPr>
-      <w:r>
-        <w:rPr>
-          <w:rFonts w:ascii="Calibri" w:cs="Calibri" w:eastAsia="Calibri" w:hAnsi="Calibri"/>
-          <w:color w:val="222B36"/>
+        <w:spacing w:after="10" w:line="240"/>
+      </w:pPr>
+      <w:r>
+        <w:rPr>
+          <w:rFonts w:ascii="Calibri" w:cs="Calibri" w:eastAsia="Calibri" w:hAnsi="Calibri"/>
+          <w:color w:val="F2F2F2"/>
           <w:sz w:val="19"/>
           <w:szCs w:val="19"/>
         </w:rPr>
@@ -513,12 +552,12 @@
           <w:ilvl w:val="0"/>
           <w:numId w:val="2"/>
         </w:numPr>
-        <w:spacing w:after="25" w:line="245"/>
-      </w:pPr>
-      <w:r>
-        <w:rPr>
-          <w:rFonts w:ascii="Calibri" w:cs="Calibri" w:eastAsia="Calibri" w:hAnsi="Calibri"/>
-          <w:color w:val="222B36"/>
+        <w:spacing w:after="10" w:line="240"/>
+      </w:pPr>
+      <w:r>
+        <w:rPr>
+          <w:rFonts w:ascii="Calibri" w:cs="Calibri" w:eastAsia="Calibri" w:hAnsi="Calibri"/>
+          <w:color w:val="F2F2F2"/>
           <w:sz w:val="19"/>
           <w:szCs w:val="19"/>
         </w:rPr>
@@ -531,14 +570,14 @@
         <w:tabs>
           <w:tab w:val="right" w:pos="10206"/>
         </w:tabs>
-        <w:spacing w:after="15" w:before="90"/>
+        <w:spacing w:after="10" w:before="60"/>
       </w:pPr>
       <w:r>
         <w:rPr>
           <w:rFonts w:ascii="Calibri" w:cs="Calibri" w:eastAsia="Calibri" w:hAnsi="Calibri"/>
           <w:b/>
           <w:bCs/>
-          <w:color w:val="1F3A5F"/>
+          <w:color w:val="4FD1C5"/>
           <w:sz w:val="22"/>
           <w:szCs w:val="22"/>
         </w:rPr>
@@ -547,7 +586,7 @@
       <w:r>
         <w:rPr>
           <w:rFonts w:ascii="Calibri" w:cs="Calibri" w:eastAsia="Calibri" w:hAnsi="Calibri"/>
-          <w:color w:val="5A6472"/>
+          <w:color w:val="A9B4C0"/>
           <w:sz w:val="19"/>
           <w:szCs w:val="19"/>
         </w:rPr>
@@ -561,12 +600,12 @@
           <w:ilvl w:val="0"/>
           <w:numId w:val="2"/>
         </w:numPr>
-        <w:spacing w:after="25" w:line="245"/>
-      </w:pPr>
-      <w:r>
-        <w:rPr>
-          <w:rFonts w:ascii="Calibri" w:cs="Calibri" w:eastAsia="Calibri" w:hAnsi="Calibri"/>
-          <w:color w:val="222B36"/>
+        <w:spacing w:after="10" w:line="240"/>
+      </w:pPr>
+      <w:r>
+        <w:rPr>
+          <w:rFonts w:ascii="Calibri" w:cs="Calibri" w:eastAsia="Calibri" w:hAnsi="Calibri"/>
+          <w:color w:val="F2F2F2"/>
           <w:sz w:val="19"/>
           <w:szCs w:val="19"/>
         </w:rPr>
@@ -580,12 +619,12 @@
           <w:ilvl w:val="0"/>
           <w:numId w:val="2"/>
         </w:numPr>
-        <w:spacing w:after="25" w:line="245"/>
-      </w:pPr>
-      <w:r>
-        <w:rPr>
-          <w:rFonts w:ascii="Calibri" w:cs="Calibri" w:eastAsia="Calibri" w:hAnsi="Calibri"/>
-          <w:color w:val="222B36"/>
+        <w:spacing w:after="10" w:line="240"/>
+      </w:pPr>
+      <w:r>
+        <w:rPr>
+          <w:rFonts w:ascii="Calibri" w:cs="Calibri" w:eastAsia="Calibri" w:hAnsi="Calibri"/>
+          <w:color w:val="F2F2F2"/>
           <w:sz w:val="19"/>
           <w:szCs w:val="19"/>
         </w:rPr>
@@ -599,12 +638,12 @@
           <w:ilvl w:val="0"/>
           <w:numId w:val="2"/>
         </w:numPr>
-        <w:spacing w:after="25" w:line="245"/>
-      </w:pPr>
-      <w:r>
-        <w:rPr>
-          <w:rFonts w:ascii="Calibri" w:cs="Calibri" w:eastAsia="Calibri" w:hAnsi="Calibri"/>
-          <w:color w:val="222B36"/>
+        <w:spacing w:after="10" w:line="240"/>
+      </w:pPr>
+      <w:r>
+        <w:rPr>
+          <w:rFonts w:ascii="Calibri" w:cs="Calibri" w:eastAsia="Calibri" w:hAnsi="Calibri"/>
+          <w:color w:val="F2F2F2"/>
           <w:sz w:val="19"/>
           <w:szCs w:val="19"/>
         </w:rPr>
@@ -615,16 +654,16 @@
       <w:pPr>
         <w:keepNext/>
         <w:pBdr>
-          <w:bottom w:val="single" w:color="2A7F8E" w:sz="8" w:space="3"/>
+          <w:bottom w:val="single" w:color="4FD1C5" w:sz="8" w:space="3"/>
         </w:pBdr>
-        <w:spacing w:after="70" w:before="140"/>
+        <w:spacing w:after="50" w:before="90"/>
       </w:pPr>
       <w:r>
         <w:rPr>
           <w:rFonts w:ascii="Calibri" w:cs="Calibri" w:eastAsia="Calibri" w:hAnsi="Calibri"/>
           <w:b/>
           <w:bCs/>
-          <w:color w:val="1F3A5F"/>
+          <w:color w:val="4FD1C5"/>
           <w:spacing w:val="40"/>
           <w:sz w:val="23"/>
           <w:szCs w:val="23"/>
@@ -638,14 +677,14 @@
         <w:tabs>
           <w:tab w:val="right" w:pos="10206"/>
         </w:tabs>
-        <w:spacing w:after="15" w:before="90"/>
+        <w:spacing w:after="10" w:before="60"/>
       </w:pPr>
       <w:r>
         <w:rPr>
           <w:rFonts w:ascii="Calibri" w:cs="Calibri" w:eastAsia="Calibri" w:hAnsi="Calibri"/>
           <w:b/>
           <w:bCs/>
-          <w:color w:val="1F3A5F"/>
+          <w:color w:val="4FD1C5"/>
           <w:sz w:val="22"/>
           <w:szCs w:val="22"/>
         </w:rPr>
@@ -654,7 +693,7 @@
       <w:r>
         <w:rPr>
           <w:rFonts w:ascii="Calibri" w:cs="Calibri" w:eastAsia="Calibri" w:hAnsi="Calibri"/>
-          <w:color w:val="5A6472"/>
+          <w:color w:val="A9B4C0"/>
           <w:sz w:val="19"/>
           <w:szCs w:val="19"/>
         </w:rPr>
@@ -667,14 +706,14 @@
         <w:tabs>
           <w:tab w:val="right" w:pos="10206"/>
         </w:tabs>
-        <w:spacing w:after="15" w:before="90"/>
+        <w:spacing w:after="10" w:before="60"/>
       </w:pPr>
       <w:r>
         <w:rPr>
           <w:rFonts w:ascii="Calibri" w:cs="Calibri" w:eastAsia="Calibri" w:hAnsi="Calibri"/>
           <w:b/>
           <w:bCs/>
-          <w:color w:val="1F3A5F"/>
+          <w:color w:val="4FD1C5"/>
           <w:sz w:val="22"/>
           <w:szCs w:val="22"/>
         </w:rPr>
@@ -683,7 +722,7 @@
       <w:r>
         <w:rPr>
           <w:rFonts w:ascii="Calibri" w:cs="Calibri" w:eastAsia="Calibri" w:hAnsi="Calibri"/>
-          <w:color w:val="5A6472"/>
+          <w:color w:val="A9B4C0"/>
           <w:sz w:val="19"/>
           <w:szCs w:val="19"/>
         </w:rPr>
@@ -696,14 +735,14 @@
         <w:tabs>
           <w:tab w:val="right" w:pos="10206"/>
         </w:tabs>
-        <w:spacing w:after="15" w:before="90"/>
+        <w:spacing w:after="10" w:before="60"/>
       </w:pPr>
       <w:r>
         <w:rPr>
           <w:rFonts w:ascii="Calibri" w:cs="Calibri" w:eastAsia="Calibri" w:hAnsi="Calibri"/>
           <w:b/>
           <w:bCs/>
-          <w:color w:val="1F3A5F"/>
+          <w:color w:val="4FD1C5"/>
           <w:sz w:val="22"/>
           <w:szCs w:val="22"/>
         </w:rPr>
@@ -712,7 +751,7 @@
       <w:r>
         <w:rPr>
           <w:rFonts w:ascii="Calibri" w:cs="Calibri" w:eastAsia="Calibri" w:hAnsi="Calibri"/>
-          <w:color w:val="5A6472"/>
+          <w:color w:val="A9B4C0"/>
           <w:sz w:val="19"/>
           <w:szCs w:val="19"/>
         </w:rPr>
@@ -723,16 +762,16 @@
       <w:pPr>
         <w:keepNext/>
         <w:pBdr>
-          <w:bottom w:val="single" w:color="2A7F8E" w:sz="8" w:space="3"/>
+          <w:bottom w:val="single" w:color="4FD1C5" w:sz="8" w:space="3"/>
         </w:pBdr>
-        <w:spacing w:after="70" w:before="140"/>
+        <w:spacing w:after="50" w:before="90"/>
       </w:pPr>
       <w:r>
         <w:rPr>
           <w:rFonts w:ascii="Calibri" w:cs="Calibri" w:eastAsia="Calibri" w:hAnsi="Calibri"/>
           <w:b/>
           <w:bCs/>
-          <w:color w:val="1F3A5F"/>
+          <w:color w:val="4FD1C5"/>
           <w:spacing w:val="40"/>
           <w:sz w:val="23"/>
           <w:szCs w:val="23"/>
@@ -780,12 +819,12 @@
                 <w:ilvl w:val="0"/>
                 <w:numId w:val="2"/>
               </w:numPr>
-              <w:spacing w:after="25" w:line="245"/>
+              <w:spacing w:after="10" w:line="240"/>
             </w:pPr>
             <w:r>
               <w:rPr>
                 <w:rFonts w:ascii="Calibri" w:cs="Calibri" w:eastAsia="Calibri" w:hAnsi="Calibri"/>
-                <w:color w:val="222B36"/>
+                <w:color w:val="F2F2F2"/>
                 <w:sz w:val="19"/>
                 <w:szCs w:val="19"/>
               </w:rPr>
@@ -799,12 +838,12 @@
                 <w:ilvl w:val="0"/>
                 <w:numId w:val="2"/>
               </w:numPr>
-              <w:spacing w:after="25" w:line="245"/>
+              <w:spacing w:after="10" w:line="240"/>
             </w:pPr>
             <w:r>
               <w:rPr>
                 <w:rFonts w:ascii="Calibri" w:cs="Calibri" w:eastAsia="Calibri" w:hAnsi="Calibri"/>
-                <w:color w:val="222B36"/>
+                <w:color w:val="F2F2F2"/>
                 <w:sz w:val="19"/>
                 <w:szCs w:val="19"/>
               </w:rPr>
@@ -818,16 +857,35 @@
                 <w:ilvl w:val="0"/>
                 <w:numId w:val="2"/>
               </w:numPr>
-              <w:spacing w:after="25" w:line="245"/>
+              <w:spacing w:after="10" w:line="240"/>
             </w:pPr>
             <w:r>
               <w:rPr>
                 <w:rFonts w:ascii="Calibri" w:cs="Calibri" w:eastAsia="Calibri" w:hAnsi="Calibri"/>
-                <w:color w:val="222B36"/>
+                <w:color w:val="F2F2F2"/>
                 <w:sz w:val="19"/>
                 <w:szCs w:val="19"/>
               </w:rPr>
               <w:t xml:space="preserve">Microsoft SQL Server — procedures e scripts</w:t>
+            </w:r>
+          </w:p>
+          <w:p>
+            <w:pPr>
+              <w:pStyle w:val="ListParagraph"/>
+              <w:numPr>
+                <w:ilvl w:val="0"/>
+                <w:numId w:val="2"/>
+              </w:numPr>
+              <w:spacing w:after="10" w:line="240"/>
+            </w:pPr>
+            <w:r>
+              <w:rPr>
+                <w:rFonts w:ascii="Calibri" w:cs="Calibri" w:eastAsia="Calibri" w:hAnsi="Calibri"/>
+                <w:color w:val="F2F2F2"/>
+                <w:sz w:val="19"/>
+                <w:szCs w:val="19"/>
+              </w:rPr>
+              <w:t xml:space="preserve">Versionamento de código com Git</w:t>
             </w:r>
           </w:p>
         </w:tc>
@@ -854,12 +912,12 @@
                 <w:ilvl w:val="0"/>
                 <w:numId w:val="2"/>
               </w:numPr>
-              <w:spacing w:after="25" w:line="245"/>
+              <w:spacing w:after="10" w:line="240"/>
             </w:pPr>
             <w:r>
               <w:rPr>
                 <w:rFonts w:ascii="Calibri" w:cs="Calibri" w:eastAsia="Calibri" w:hAnsi="Calibri"/>
-                <w:color w:val="222B36"/>
+                <w:color w:val="F2F2F2"/>
                 <w:sz w:val="19"/>
                 <w:szCs w:val="19"/>
               </w:rPr>
@@ -873,12 +931,12 @@
                 <w:ilvl w:val="0"/>
                 <w:numId w:val="2"/>
               </w:numPr>
-              <w:spacing w:after="25" w:line="245"/>
+              <w:spacing w:after="10" w:line="240"/>
             </w:pPr>
             <w:r>
               <w:rPr>
                 <w:rFonts w:ascii="Calibri" w:cs="Calibri" w:eastAsia="Calibri" w:hAnsi="Calibri"/>
-                <w:color w:val="222B36"/>
+                <w:color w:val="F2F2F2"/>
                 <w:sz w:val="19"/>
                 <w:szCs w:val="19"/>
               </w:rPr>
@@ -892,18 +950,37 @@
                 <w:ilvl w:val="0"/>
                 <w:numId w:val="2"/>
               </w:numPr>
-              <w:spacing w:after="25" w:line="245"/>
+              <w:spacing w:after="10" w:line="240"/>
             </w:pPr>
             <w:r>
               <w:rPr>
                 <w:rFonts w:ascii="Calibri" w:cs="Calibri" w:eastAsia="Calibri" w:hAnsi="Calibri"/>
-                <w:color w:val="222B36"/>
+                <w:color w:val="F2F2F2"/>
                 <w:sz w:val="19"/>
                 <w:szCs w:val="19"/>
               </w:rPr>
               <w:t xml:space="preserve">Excel avançado e rotinas financeiras</w:t>
             </w:r>
           </w:p>
+          <w:p>
+            <w:pPr>
+              <w:pStyle w:val="ListParagraph"/>
+              <w:numPr>
+                <w:ilvl w:val="0"/>
+                <w:numId w:val="2"/>
+              </w:numPr>
+              <w:spacing w:after="10" w:line="240"/>
+            </w:pPr>
+            <w:r>
+              <w:rPr>
+                <w:rFonts w:ascii="Calibri" w:cs="Calibri" w:eastAsia="Calibri" w:hAnsi="Calibri"/>
+                <w:color w:val="F2F2F2"/>
+                <w:sz w:val="19"/>
+                <w:szCs w:val="19"/>
+              </w:rPr>
+              <w:t xml:space="preserve">Metodologia ágil Scrum</w:t>
+            </w:r>
+          </w:p>
         </w:tc>
       </w:tr>
     </w:tbl>
@@ -911,16 +988,16 @@
       <w:pPr>
         <w:keepNext/>
         <w:pBdr>
-          <w:bottom w:val="single" w:color="2A7F8E" w:sz="8" w:space="3"/>
+          <w:bottom w:val="single" w:color="4FD1C5" w:sz="8" w:space="3"/>
         </w:pBdr>
-        <w:spacing w:after="70" w:before="140"/>
+        <w:spacing w:after="50" w:before="90"/>
       </w:pPr>
       <w:r>
         <w:rPr>
           <w:rFonts w:ascii="Calibri" w:cs="Calibri" w:eastAsia="Calibri" w:hAnsi="Calibri"/>
           <w:b/>
           <w:bCs/>
-          <w:color w:val="1F3A5F"/>
+          <w:color w:val="4FD1C5"/>
           <w:spacing w:val="40"/>
           <w:sz w:val="23"/>
           <w:szCs w:val="23"/>
@@ -968,12 +1045,12 @@
                 <w:ilvl w:val="0"/>
                 <w:numId w:val="2"/>
               </w:numPr>
-              <w:spacing w:after="25" w:line="245"/>
+              <w:spacing w:after="10" w:line="240"/>
             </w:pPr>
             <w:r>
               <w:rPr>
                 <w:rFonts w:ascii="Calibri" w:cs="Calibri" w:eastAsia="Calibri" w:hAnsi="Calibri"/>
-                <w:color w:val="222B36"/>
+                <w:color w:val="F2F2F2"/>
                 <w:sz w:val="19"/>
                 <w:szCs w:val="19"/>
               </w:rPr>
@@ -987,12 +1064,12 @@
                 <w:ilvl w:val="0"/>
                 <w:numId w:val="2"/>
               </w:numPr>
-              <w:spacing w:after="25" w:line="245"/>
+              <w:spacing w:after="10" w:line="240"/>
             </w:pPr>
             <w:r>
               <w:rPr>
                 <w:rFonts w:ascii="Calibri" w:cs="Calibri" w:eastAsia="Calibri" w:hAnsi="Calibri"/>
-                <w:color w:val="222B36"/>
+                <w:color w:val="F2F2F2"/>
                 <w:sz w:val="19"/>
                 <w:szCs w:val="19"/>
               </w:rPr>
@@ -1023,12 +1100,12 @@
                 <w:ilvl w:val="0"/>
                 <w:numId w:val="2"/>
               </w:numPr>
-              <w:spacing w:after="25" w:line="245"/>
+              <w:spacing w:after="10" w:line="240"/>
             </w:pPr>
             <w:r>
               <w:rPr>
                 <w:rFonts w:ascii="Calibri" w:cs="Calibri" w:eastAsia="Calibri" w:hAnsi="Calibri"/>
-                <w:color w:val="222B36"/>
+                <w:color w:val="F2F2F2"/>
                 <w:sz w:val="19"/>
                 <w:szCs w:val="19"/>
               </w:rPr>
@@ -1042,12 +1119,12 @@
                 <w:ilvl w:val="0"/>
                 <w:numId w:val="2"/>
               </w:numPr>
-              <w:spacing w:after="25" w:line="245"/>
+              <w:spacing w:after="10" w:line="240"/>
             </w:pPr>
             <w:r>
               <w:rPr>
                 <w:rFonts w:ascii="Calibri" w:cs="Calibri" w:eastAsia="Calibri" w:hAnsi="Calibri"/>
-                <w:color w:val="222B36"/>
+                <w:color w:val="F2F2F2"/>
                 <w:sz w:val="19"/>
                 <w:szCs w:val="19"/>
               </w:rPr>
@@ -1242,7 +1319,7 @@
         <w:ind w:left="360" w:hanging="240"/>
       </w:pPr>
       <w:rPr>
-        <w:color w:val="2A7F8E"/>
+        <w:color w:val="4FD1C5"/>
       </w:rPr>
     </w:lvl>
   </w:abstractNum>

</xml_diff>